<commit_message>
docs: mise à jour du Product Vision Board
</commit_message>
<xml_diff>
--- a/docs/cadrage/Product-vision-board.docx
+++ b/docs/cadrage/Product-vision-board.docx
@@ -790,7 +790,7 @@
       </w:tr>
       <w:tr xmlns:wp14="http://schemas.microsoft.com/office/word/2010/wordml" wp14:textId="77777777">
         <w:trPr>
-          <w:trHeight w:val="2844"/>
+          <w:trHeight w:val="2910"/>
         </w:trPr>
         <w:tc>
           <w:tcPr>
@@ -1226,7 +1226,7 @@
             </w:tcMar>
             <w:vAlign w:val="center"/>
           </w:tcPr>
-          <w:p wp14:textId="77777777">
+          <w:p wp14:textId="21B29D58">
             <w:r>
               <w:rPr>
                 <w:rFonts w:ascii="Arial" w:hAnsi="Arial" w:eastAsia="Arial" w:cs="Arial"/>
@@ -1237,7 +1237,31 @@
                 <w:szCs w:val="18"/>
                 <w:lang w:val="en-US"/>
               </w:rPr>
-              <w:t>Persona 2 (Secondaire)</w:t>
+              <w:t>Persona 2 (</w:t>
+            </w:r>
+            <w:r>
+              <w:rPr>
+                <w:rFonts w:ascii="Arial" w:hAnsi="Arial" w:eastAsia="Arial" w:cs="Arial"/>
+                <w:b w:val="1"/>
+                <w:bCs w:val="1"/>
+                <w:color w:val="059669"/>
+                <w:sz w:val="18"/>
+                <w:szCs w:val="18"/>
+                <w:lang w:val="en-US"/>
+              </w:rPr>
+              <w:t>primaire</w:t>
+            </w:r>
+            <w:r>
+              <w:rPr>
+                <w:rFonts w:ascii="Arial" w:hAnsi="Arial" w:eastAsia="Arial" w:cs="Arial"/>
+                <w:b w:val="1"/>
+                <w:bCs w:val="1"/>
+                <w:color w:val="059669"/>
+                <w:sz w:val="18"/>
+                <w:szCs w:val="18"/>
+                <w:lang w:val="en-US"/>
+              </w:rPr>
+              <w:t>)</w:t>
             </w:r>
           </w:p>
         </w:tc>
@@ -1721,7 +1745,7 @@
             </w:tcMar>
             <w:vAlign w:val="center"/>
           </w:tcPr>
-          <w:p wp14:textId="77777777">
+          <w:p wp14:textId="3B3CE96F">
             <w:r>
               <w:rPr>
                 <w:rFonts w:ascii="Arial" w:hAnsi="Arial" w:eastAsia="Arial" w:cs="Arial"/>
@@ -1732,7 +1756,31 @@
                 <w:szCs w:val="18"/>
                 <w:lang w:val="en-US"/>
               </w:rPr>
-              <w:t>Persona 3 (Tertiaire, optionnel)</w:t>
+              <w:t>Persona 3 (</w:t>
+            </w:r>
+            <w:r>
+              <w:rPr>
+                <w:rFonts w:ascii="Arial" w:hAnsi="Arial" w:eastAsia="Arial" w:cs="Arial"/>
+                <w:b w:val="1"/>
+                <w:bCs w:val="1"/>
+                <w:color w:val="059669"/>
+                <w:sz w:val="18"/>
+                <w:szCs w:val="18"/>
+                <w:lang w:val="en-US"/>
+              </w:rPr>
+              <w:t>tertiaire</w:t>
+            </w:r>
+            <w:r>
+              <w:rPr>
+                <w:rFonts w:ascii="Arial" w:hAnsi="Arial" w:eastAsia="Arial" w:cs="Arial"/>
+                <w:b w:val="1"/>
+                <w:bCs w:val="1"/>
+                <w:color w:val="059669"/>
+                <w:sz w:val="18"/>
+                <w:szCs w:val="18"/>
+                <w:lang w:val="en-US"/>
+              </w:rPr>
+              <w:t>)</w:t>
             </w:r>
           </w:p>
         </w:tc>

</xml_diff>